<commit_message>
Add ML System Design M02-M23 + SITP OS notes; reorg DBMS images
</commit_message>
<xml_diff>
--- a/SITP/DBMS/Notes/M02_ER_EER_Model.docx
+++ b/SITP/DBMS/Notes/M02_ER_EER_Model.docx
@@ -9282,7 +9282,7 @@
       <w:r>
         <w:drawing>
           <wp:inline>
-            <wp:extent cx="5334000" cy="3353869"/>
+            <wp:extent cx="5334000" cy="3829250"/>
             <wp:effectExtent b="0" l="0" r="0" t="0"/>
             <wp:docPr descr="ER-to-relational mapping: 8 rules covering strong entity, weak entity, 1:1, 1:N, M:N, multivalued attribute, specialization, and ternary relationship." title="" id="66" name="Picture"/>
             <a:graphic>
@@ -9303,7 +9303,7 @@
                   <pic:spPr bwMode="auto">
                     <a:xfrm>
                       <a:off x="0" y="0"/>
-                      <a:ext cx="5334000" cy="3353869"/>
+                      <a:ext cx="5334000" cy="3829250"/>
                     </a:xfrm>
                     <a:prstGeom prst="rect">
                       <a:avLst/>

</xml_diff>